<commit_message>
Galilee 02: Druze and Circassian villages slide (2025 Q16a)
Co-Authored-By: Claude Opus 5.5 <noreply@anthropic.com>
Claude-Session: https://claude.ai/code/session_01AhWt76aQYnK2GHBZTwEpVE
</commit_message>
<xml_diff>
--- a/tayarut/galilee/02/worksheet.docx
+++ b/tayarut/galilee/02/worksheet.docx
@@ -1127,6 +1127,230 @@
           <w:szCs w:val="18"/>
           <w:rtl/>
         </w:rPr>
+        <w:t xml:space="preserve">עדות ודתות  </w:t>
+      </w:r>
+    </w:p>
+    <w:p>
+      <w:pPr>
+        <w:keepNext/>
+        <w:bidi/>
+        <w:spacing w:before="0" w:after="80"/>
+      </w:pPr>
+      <w:r>
+        <w:rPr>
+          <w:rFonts w:ascii="Arial" w:hAnsi="Arial" w:cs="Arial" w:eastAsia="Arial"/>
+          <w:b/>
+          <w:bCs/>
+          <w:i w:val="0"/>
+          <w:sz w:val="28"/>
+          <w:szCs w:val="28"/>
+          <w:rtl/>
+        </w:rPr>
+        <w:t>הכפרים הדרוזיים והצ'רקסיים בגליל</w:t>
+      </w:r>
+    </w:p>
+    <w:tbl>
+      <w:tblPr>
+        <w:tblStyle w:val="TableGrid"/>
+        <w:bidiVisual/>
+        <w:tblW w:type="auto" w:w="0"/>
+        <w:tblLayout w:type="fixed"/>
+        <w:tblLayout w:type="fixed"/>
+        <w:tblLook w:firstColumn="1" w:firstRow="1" w:lastColumn="0" w:lastRow="0" w:noHBand="0" w:noVBand="1" w:val="04A0"/>
+      </w:tblPr>
+      <w:tblGrid>
+        <w:gridCol w:w="2721"/>
+        <w:gridCol w:w="7143"/>
+      </w:tblGrid>
+      <w:tr>
+        <w:trPr>
+          <w:cantSplit/>
+          <w:tblHeader/>
+        </w:trPr>
+        <w:tc>
+          <w:tcPr>
+            <w:tcW w:type="dxa" w:w="2721"/>
+            <w:shd w:val="clear" w:fill="E6E6E6"/>
+          </w:tcPr>
+          <w:p>
+            <w:pPr>
+              <w:bidi/>
+            </w:pPr>
+          </w:p>
+        </w:tc>
+        <w:tc>
+          <w:tcPr>
+            <w:tcW w:type="dxa" w:w="7143"/>
+            <w:shd w:val="clear" w:fill="E6E6E6"/>
+          </w:tcPr>
+          <w:p>
+            <w:pPr>
+              <w:bidi/>
+            </w:pPr>
+            <w:r>
+              <w:rPr>
+                <w:rFonts w:ascii="Arial" w:hAnsi="Arial" w:cs="Arial" w:eastAsia="Arial"/>
+                <w:b/>
+                <w:bCs/>
+                <w:i w:val="0"/>
+                <w:sz w:val="21"/>
+                <w:szCs w:val="21"/>
+                <w:rtl/>
+              </w:rPr>
+              <w:t>מה חשוב לזכור</w:t>
+            </w:r>
+          </w:p>
+        </w:tc>
+      </w:tr>
+      <w:tr>
+        <w:trPr>
+          <w:cantSplit/>
+          <w:trHeight w:val="624"/>
+        </w:trPr>
+        <w:tc>
+          <w:tcPr>
+            <w:tcW w:type="dxa" w:w="2721"/>
+          </w:tcPr>
+          <w:p>
+            <w:pPr>
+              <w:bidi/>
+            </w:pPr>
+            <w:r>
+              <w:rPr>
+                <w:rFonts w:ascii="Arial" w:hAnsi="Arial" w:cs="Arial" w:eastAsia="Arial"/>
+                <w:b/>
+                <w:bCs/>
+                <w:i w:val="0"/>
+                <w:sz w:val="21"/>
+                <w:szCs w:val="21"/>
+                <w:rtl/>
+              </w:rPr>
+              <w:t>כפרים דרוזיים</w:t>
+            </w:r>
+          </w:p>
+        </w:tc>
+        <w:tc>
+          <w:tcPr>
+            <w:tcW w:type="dxa" w:w="7143"/>
+          </w:tcPr>
+          <w:p>
+            <w:pPr>
+              <w:bidi/>
+            </w:pPr>
+          </w:p>
+        </w:tc>
+      </w:tr>
+      <w:tr>
+        <w:trPr>
+          <w:cantSplit/>
+          <w:trHeight w:val="624"/>
+        </w:trPr>
+        <w:tc>
+          <w:tcPr>
+            <w:tcW w:type="dxa" w:w="2721"/>
+          </w:tcPr>
+          <w:p>
+            <w:pPr>
+              <w:bidi/>
+            </w:pPr>
+            <w:r>
+              <w:rPr>
+                <w:rFonts w:ascii="Arial" w:hAnsi="Arial" w:cs="Arial" w:eastAsia="Arial"/>
+                <w:b/>
+                <w:bCs/>
+                <w:i w:val="0"/>
+                <w:sz w:val="21"/>
+                <w:szCs w:val="21"/>
+                <w:rtl/>
+              </w:rPr>
+              <w:t>כפרים צ'רקסיים</w:t>
+            </w:r>
+          </w:p>
+        </w:tc>
+        <w:tc>
+          <w:tcPr>
+            <w:tcW w:type="dxa" w:w="7143"/>
+          </w:tcPr>
+          <w:p>
+            <w:pPr>
+              <w:bidi/>
+            </w:pPr>
+          </w:p>
+        </w:tc>
+      </w:tr>
+      <w:tr>
+        <w:trPr>
+          <w:cantSplit/>
+          <w:trHeight w:val="624"/>
+        </w:trPr>
+        <w:tc>
+          <w:tcPr>
+            <w:tcW w:type="dxa" w:w="2721"/>
+          </w:tcPr>
+          <w:p>
+            <w:pPr>
+              <w:bidi/>
+            </w:pPr>
+            <w:r>
+              <w:rPr>
+                <w:rFonts w:ascii="Arial" w:hAnsi="Arial" w:cs="Arial" w:eastAsia="Arial"/>
+                <w:b/>
+                <w:bCs/>
+                <w:i w:val="0"/>
+                <w:sz w:val="21"/>
+                <w:szCs w:val="21"/>
+                <w:rtl/>
+              </w:rPr>
+              <w:t>מה מציעים לתיירים</w:t>
+            </w:r>
+          </w:p>
+        </w:tc>
+        <w:tc>
+          <w:tcPr>
+            <w:tcW w:type="dxa" w:w="7143"/>
+          </w:tcPr>
+          <w:p>
+            <w:pPr>
+              <w:bidi/>
+            </w:pPr>
+          </w:p>
+        </w:tc>
+      </w:tr>
+    </w:tbl>
+    <w:p>
+      <w:pPr>
+        <w:bidi/>
+        <w:spacing w:before="0" w:after="80"/>
+      </w:pPr>
+    </w:p>
+    <w:p>
+      <w:pPr>
+        <w:keepNext/>
+        <w:bidi/>
+        <w:spacing w:before="200" w:after="40"/>
+      </w:pPr>
+      <w:r>
+        <w:rPr>
+          <w:rFonts w:ascii="Arial" w:hAnsi="Arial" w:cs="Arial" w:eastAsia="Arial"/>
+          <w:b w:val="0"/>
+          <w:i w:val="0"/>
+          <w:color w:val="555555"/>
+          <w:sz w:val="18"/>
+          <w:szCs w:val="18"/>
+          <w:rtl/>
+        </w:rPr>
+        <w:t xml:space="preserve">שקף 7  </w:t>
+      </w:r>
+      <w:r>
+        <w:rPr>
+          <w:rFonts w:ascii="Arial" w:hAnsi="Arial" w:cs="Arial" w:eastAsia="Arial"/>
+          <w:b w:val="0"/>
+          <w:i w:val="0"/>
+          <w:color w:val="555555"/>
+          <w:sz w:val="18"/>
+          <w:szCs w:val="18"/>
+          <w:rtl/>
+        </w:rPr>
         <w:t xml:space="preserve">המושבות הראשונות  </w:t>
       </w:r>
     </w:p>
@@ -1339,7 +1563,7 @@
           <w:szCs w:val="18"/>
           <w:rtl/>
         </w:rPr>
-        <w:t xml:space="preserve">שקף 7  </w:t>
+        <w:t xml:space="preserve">שקף 8  </w:t>
       </w:r>
       <w:r>
         <w:rPr>
@@ -1525,7 +1749,7 @@
           <w:szCs w:val="18"/>
           <w:rtl/>
         </w:rPr>
-        <w:t xml:space="preserve">שקף 8  </w:t>
+        <w:t xml:space="preserve">שקף 9  </w:t>
       </w:r>
       <w:r>
         <w:rPr>
@@ -1985,7 +2209,7 @@
           <w:szCs w:val="18"/>
           <w:rtl/>
         </w:rPr>
-        <w:t xml:space="preserve">שקף 11  </w:t>
+        <w:t xml:space="preserve">שקף 12  </w:t>
       </w:r>
     </w:p>
     <w:p>

</xml_diff>